<commit_message>
release 0.1.331: Event/Timer view (IEVENT scan, protocol/module name resolution, Handle jump, global-search merge, 12x2 button bar)
</commit_message>
<xml_diff>
--- a/docs/manual/gudumpinfo-说明书-简版.docx
+++ b/docs/manual/gudumpinfo-说明书-简版.docx
@@ -219,7 +219,7 @@
           <w:sz w:val="21"/>
           <w:szCs w:val="21"/>
         </w:rPr>
-        <w:t xml:space="preserve">主界面左侧排列全部 18 个功能视图按钮，右侧为内容区。下表列出各视图与 UEFI Shell 命令的对应关系，"独家"表示该能力没有对应的 Shell 命令。</w:t>
+        <w:t xml:space="preserve">主界面左侧排列全部 19 个功能视图按钮，右侧为内容区。下表列出各视图与 UEFI Shell 命令的对应关系，"独家"表示该能力没有对应的 Shell 命令。</w:t>
       </w:r>
     </w:p>
     <w:p>
@@ -2047,6 +2047,98 @@
                 <w:szCs w:val="19"/>
               </w:rPr>
               <w:t xml:space="preserve">Secure Boot 状态与签名库</w:t>
+            </w:r>
+          </w:p>
+        </w:tc>
+      </w:tr>
+      <w:tr>
+        <w:trPr>
+          <w:tblHeader w:val="false"/>
+        </w:trPr>
+        <w:tc>
+          <w:tcPr>
+            <w:tcW w:type="dxa" w:w="3008"/>
+            <w:tcBorders>
+              <w:top w:val="single" w:color="BFBFBF" w:sz="4"/>
+              <w:left w:val="single" w:color="BFBFBF" w:sz="4"/>
+              <w:bottom w:val="single" w:color="BFBFBF" w:sz="4"/>
+              <w:right w:val="single" w:color="BFBFBF" w:sz="4"/>
+            </w:tcBorders>
+            <w:tcMar>
+              <w:top w:type="dxa" w:w="60"/>
+              <w:left w:type="dxa" w:w="100"/>
+              <w:bottom w:type="dxa" w:w="60"/>
+              <w:right w:type="dxa" w:w="100"/>
+            </w:tcMar>
+          </w:tcPr>
+          <w:p>
+            <w:r>
+              <w:rPr>
+                <w:rFonts w:ascii="SimSun" w:eastAsia="SimSun" w:hAnsi="SimSun"/>
+                <w:b w:val="false"/>
+                <w:bCs w:val="false"/>
+                <w:sz w:val="19"/>
+                <w:szCs w:val="19"/>
+              </w:rPr>
+              <w:t xml:space="preserve">Event/Timer</w:t>
+            </w:r>
+          </w:p>
+        </w:tc>
+        <w:tc>
+          <w:tcPr>
+            <w:tcW w:type="dxa" w:w="3008"/>
+            <w:tcBorders>
+              <w:top w:val="single" w:color="BFBFBF" w:sz="4"/>
+              <w:left w:val="single" w:color="BFBFBF" w:sz="4"/>
+              <w:bottom w:val="single" w:color="BFBFBF" w:sz="4"/>
+              <w:right w:val="single" w:color="BFBFBF" w:sz="4"/>
+            </w:tcBorders>
+            <w:tcMar>
+              <w:top w:type="dxa" w:w="60"/>
+              <w:left w:type="dxa" w:w="100"/>
+              <w:bottom w:type="dxa" w:w="60"/>
+              <w:right w:type="dxa" w:w="100"/>
+            </w:tcMar>
+          </w:tcPr>
+          <w:p>
+            <w:r>
+              <w:rPr>
+                <w:rFonts w:ascii="SimSun" w:eastAsia="SimSun" w:hAnsi="SimSun"/>
+                <w:b w:val="false"/>
+                <w:bCs w:val="false"/>
+                <w:sz w:val="19"/>
+                <w:szCs w:val="19"/>
+              </w:rPr>
+              <w:t xml:space="preserve">独家</w:t>
+            </w:r>
+          </w:p>
+        </w:tc>
+        <w:tc>
+          <w:tcPr>
+            <w:tcW w:type="dxa" w:w="3010"/>
+            <w:tcBorders>
+              <w:top w:val="single" w:color="BFBFBF" w:sz="4"/>
+              <w:left w:val="single" w:color="BFBFBF" w:sz="4"/>
+              <w:bottom w:val="single" w:color="BFBFBF" w:sz="4"/>
+              <w:right w:val="single" w:color="BFBFBF" w:sz="4"/>
+            </w:tcBorders>
+            <w:tcMar>
+              <w:top w:type="dxa" w:w="60"/>
+              <w:left w:type="dxa" w:w="100"/>
+              <w:bottom w:type="dxa" w:w="60"/>
+              <w:right w:type="dxa" w:w="100"/>
+            </w:tcMar>
+          </w:tcPr>
+          <w:p>
+            <w:r>
+              <w:rPr>
+                <w:rFonts w:ascii="SimSun" w:eastAsia="SimSun" w:hAnsi="SimSun"/>
+                <w:b w:val="false"/>
+                <w:bCs w:val="false"/>
+                <w:sz w:val="19"/>
+                <w:szCs w:val="19"/>
+              </w:rPr>
+              <w:t xml:space="preserve">全系统事件与定时器扫描：事件对象、通知回调、挂载协议、周期定时器，支持按组名/协议名/模块名模糊搜索</w:t>
             </w:r>
           </w:p>
         </w:tc>

</xml_diff>

<commit_message>
0.1.347 - ARM64 dual-arch release: AARCH64 efi + docs + README
- GudumpInfo-AARCH64.efi (new): ARM64 build (MSVC ARM64, verified on QEMU
  virt + Kunpeng 920B)
- GudumpInfo.efi: X64 0.1.347 (unchanged name, backward compatible)
- README: dual-arch support (grayed x86 views on AArch64, build/verify notes)
- docs/manual: ARM64 support section added to brief+detailed manuals
- VERSION.txt: 0.1.347
</commit_message>
<xml_diff>
--- a/docs/manual/gudumpinfo-说明书-简版.docx
+++ b/docs/manual/gudumpinfo-说明书-简版.docx
@@ -45,7 +45,7 @@
           <w:sz w:val="21"/>
           <w:szCs w:val="21"/>
         </w:rPr>
-        <w:t xml:space="preserve">*适用版本 0.1.297 ｜ 2026 年 8 月*</w:t>
+        <w:t>*适用版本 0.1.347 ｜ 2026 年 8 月*</w:t>
       </w:r>
     </w:p>
     <w:p>
@@ -2574,6 +2574,29 @@
           <w:szCs w:val="24"/>
         </w:rPr>
         <w:t xml:space="preserve">结语</w:t>
+      </w:r>
+    </w:p>
+    <w:p>
+      <w:pPr>
+        <w:pStyle w:val="Heading2"/>
+      </w:pPr>
+      <w:r>
+        <w:t>八、ARM64 支持说明</w:t>
+      </w:r>
+    </w:p>
+    <w:p>
+      <w:r>
+        <w:t>**灰调视图。** CPUID、IO 端口、MSR 三个视图读取 x86 专属寄存器与端口空间（cpuid/in/out/rdmsr/wrmsr 指令），在 AARCH64 上没有对应语义。构建时用 GUDUMP_X86_VIEWS 宏做架构门控（X64=1 注册真实视图，AARCH64=0 不注册），未注册的槽位按钮走 ButtonBar 的置灰机制（LVGL LV_STATE_DISABLED 灰态且点击被丢弃；注意与"开发中"占位按钮不同——占位可点击显示"正在开发中"）。X64 上这三个按钮正常可用，AARCH64 上置灰不可点，其余 16 个可用视图按钮与 5 个占位按钮两架构完全一致。</w:t>
+      </w:r>
+    </w:p>
+    <w:p>
+      <w:r>
+        <w:t>**Event 自校准在 ARM64 的结果。** Event/Timer 视图的事件扫描以 EDK2 事件对象内存布局为基础，不同固件由自校准事件验证兼容性（见 5.19 节）。ARM64 验证（ArmVirtQemu 固件）记录：自校准通过（98 entries，calib 1），即 AArch64 固件上事件对象结构校验同样成立。ARM64 首跑还暴露并修复了两个问题：Event 扫描的跨页越界崩溃（分页读取前先做内存可读性守卫）与绝对指针鼠标漂移导致的点击失效（改为按 app 日志回读指针位置重新锚定），修复均为跨架构通用代码。</w:t>
+      </w:r>
+    </w:p>
+    <w:p>
+      <w:r>
+        <w:t>**双架构构建与运行。** 一套源码支持 X64 与 AARCH64：tools\Build-DualArch.ps1 一键构建双架构（版本只递增一次），或 build -p GudumpInfoPkg\GudumpInfoPkg.dsc -a X64/-a AARCH64（同一工具链 tag VS2019，产物自动分目录）。串口调试走固件的 EFI_SERIAL_IO_PROTOCOL（无硬编码地址，找不到时静默降级——QEMU 与真机共用同一套代码）。QEMU 验证用自编译 ArmVirtQemu 固件（CLANGPDB 工具链，MSVC 编不了 .S 汇编），ARM64 启动盘独立于 x64（qemu_disk_a64）。</w:t>
       </w:r>
     </w:p>
     <w:p>

</xml_diff>